<commit_message>
Refine project documentation and browser security
</commit_message>
<xml_diff>
--- a/docs/The-Angler_README_中文审查稿.docx
+++ b/docs/The-Angler_README_中文审查稿.docx
@@ -174,7 +174,7 @@
               <w:bottom w:w="90" w:type="dxa"/>
               <w:end w:w="120" w:type="dxa"/>
             </w:tcMar>
-            <w:shd w:fill="FFF6DD"/>
+            <w:shd w:fill="F4EBCF"/>
             <w:vAlign w:val="center"/>
           </w:tcPr>
           <w:p>
@@ -185,10 +185,10 @@
               <w:rPr>
                 <w:rFonts w:ascii="Calibri" w:hAnsi="Calibri" w:eastAsia="Microsoft YaHei"/>
                 <w:b/>
-                <w:color w:val="9B1C1C"/>
+                <w:color w:val="C62A78"/>
                 <w:sz w:val="21"/>
               </w:rPr>
-              <w:t xml:space="preserve">建议先确认  </w:t>
+              <w:t xml:space="preserve">本轮确认结果  </w:t>
             </w:r>
             <w:r>
               <w:rPr>
@@ -196,7 +196,7 @@
                 <w:color w:val="10242C"/>
                 <w:sz w:val="21"/>
               </w:rPr>
-              <w:t>作者姓名已写为 Aaron Jiang，项目年份写为 2026。由于当前项目文件没有课程、学院、学校、公开试玩链接和视频链接，本版没有自行补写这些信息。</w:t>
+              <w:t>标题、作者 Aaron Jiang 和年份 2026 已确认正确。README 不补充课程、学院、学校或现场设备信息；公开试玩和视频链接待后续完成后再加入。</w:t>
             </w:r>
           </w:p>
         </w:tc>
@@ -277,7 +277,7 @@
                 <w:color w:val="FFFFFF"/>
                 <w:sz w:val="18"/>
               </w:rPr>
-              <w:t>需确认事项</w:t>
+              <w:t>事项</w:t>
             </w:r>
           </w:p>
         </w:tc>
@@ -305,7 +305,7 @@
                 <w:color w:val="FFFFFF"/>
                 <w:sz w:val="18"/>
               </w:rPr>
-              <w:t>当前处理</w:t>
+              <w:t>已确认处理</w:t>
             </w:r>
           </w:p>
         </w:tc>
@@ -359,7 +359,7 @@
                 <w:color w:val="10242C"/>
                 <w:sz w:val="18"/>
               </w:rPr>
-              <w:t>课程与院校信息</w:t>
+              <w:t>标题信息</w:t>
             </w:r>
           </w:p>
         </w:tc>
@@ -385,7 +385,7 @@
                 <w:color w:val="10242C"/>
                 <w:sz w:val="18"/>
               </w:rPr>
-              <w:t>项目文件中没有可靠记录；如学校要求，应由作者补充正式英文名称。</w:t>
+              <w:t>The Angler: Beneath the Surface?、Aaron Jiang 和 2026 已确认。</w:t>
             </w:r>
           </w:p>
         </w:tc>
@@ -441,7 +441,7 @@
                 <w:color w:val="10242C"/>
                 <w:sz w:val="18"/>
               </w:rPr>
-              <w:t>Signal Canal</w:t>
+              <w:t>课程与现场信息</w:t>
             </w:r>
           </w:p>
         </w:tc>
@@ -468,7 +468,7 @@
                 <w:color w:val="10242C"/>
                 <w:sz w:val="18"/>
               </w:rPr>
-              <w:t>界面写 Search &amp; Synthesis，但当前 OpenAI 请求没有实时网页搜索工具；README 已明确限制。</w:t>
+              <w:t>按作者决定不加入课程、学院、学校、设备尺寸或现场引导检查项。</w:t>
             </w:r>
           </w:p>
         </w:tc>
@@ -522,7 +522,7 @@
                 <w:color w:val="10242C"/>
                 <w:sz w:val="18"/>
               </w:rPr>
-              <w:t>RetroSans</w:t>
+              <w:t>Signal Canal</w:t>
             </w:r>
           </w:p>
         </w:tc>
@@ -548,7 +548,7 @@
                 <w:color w:val="10242C"/>
                 <w:sz w:val="18"/>
               </w:rPr>
-              <w:t>仓库中没有对应许可证文件；公开发布前必须确认再分发权限。</w:t>
+              <w:t>保留 Search &amp; Synthesis 的搜索导向表达，但明确它没有实时 web search，不能宣称联网核查。</w:t>
             </w:r>
           </w:p>
         </w:tc>
@@ -604,7 +604,7 @@
                 <w:color w:val="10242C"/>
                 <w:sz w:val="18"/>
               </w:rPr>
-              <w:t>音频凭证</w:t>
+              <w:t>AI 使用披露</w:t>
             </w:r>
           </w:p>
         </w:tc>
@@ -631,7 +631,7 @@
                 <w:color w:val="10242C"/>
                 <w:sz w:val="18"/>
               </w:rPr>
-              <w:t>README 已列 21 个作者标识与 Pixabay ID；仍建议保存原始下载页面或许可证截图。</w:t>
+              <w:t>README 写简版真实披露；最终学校提交可另做截图示例那种完整声明。</w:t>
             </w:r>
           </w:p>
         </w:tc>
@@ -685,7 +685,7 @@
                 <w:color w:val="10242C"/>
                 <w:sz w:val="18"/>
               </w:rPr>
-              <w:t>AI 图像披露</w:t>
+              <w:t>字体与音频记录</w:t>
             </w:r>
           </w:p>
         </w:tc>
@@ -711,7 +711,7 @@
                 <w:color w:val="10242C"/>
                 <w:sz w:val="18"/>
               </w:rPr>
-              <w:t>已写为 AI 辅助生成 + 人工清理、分层与整合；请确认是否符合学校要求。</w:t>
+              <w:t>不再把 RetroSans 许可证和 Pixabay 下载凭证列为当前待办。</w:t>
             </w:r>
           </w:p>
         </w:tc>
@@ -794,7 +794,7 @@
                 <w:color w:val="10242C"/>
                 <w:sz w:val="18"/>
               </w:rPr>
-              <w:t>当前没有 Live demo 或 video URL，因此未使用空链接或占位符。</w:t>
+              <w:t>试玩和视频尚未完成；后续有 URL 时再加入，不放空链接。</w:t>
             </w:r>
           </w:p>
         </w:tc>
@@ -7424,7 +7424,7 @@
               <w:bottom w:w="90" w:type="dxa"/>
               <w:end w:w="120" w:type="dxa"/>
             </w:tcMar>
-            <w:shd w:fill="FFF6DD"/>
+            <w:shd w:fill="F4EBCF"/>
             <w:vAlign w:val="center"/>
           </w:tcPr>
           <w:p>
@@ -7435,7 +7435,7 @@
               <w:rPr>
                 <w:rFonts w:ascii="Calibri" w:hAnsi="Calibri" w:eastAsia="Microsoft YaHei"/>
                 <w:b/>
-                <w:color w:val="9B1C1C"/>
+                <w:color w:val="C62A78"/>
                 <w:sz w:val="21"/>
               </w:rPr>
               <w:t xml:space="preserve">版权记录  </w:t>
@@ -7446,7 +7446,7 @@
                 <w:color w:val="10242C"/>
                 <w:sz w:val="21"/>
               </w:rPr>
-              <w:t>目前可以确认所有活动音频来自 Pixabay，文件名保留作者标识和资源 ID，并按 Pixabay Content License 使用。为了毕设归档更稳妥，仍建议把原下载页面或许可证截图与最终提交一起保存。</w:t>
+              <w:t>目前可以确认所有活动音频来自 Pixabay，文件名保留作者标识和资源 ID，并按 Pixabay Content License 使用。README 不要求逐条附下载页面或许可证截图。</w:t>
             </w:r>
           </w:p>
         </w:tc>
@@ -8618,93 +8618,7 @@
         <w:pStyle w:val="Heading1"/>
       </w:pPr>
       <w:r>
-        <w:t>14. 建议展览设置</w:t>
-      </w:r>
-    </w:p>
-    <w:p>
-      <w:pPr>
-        <w:pStyle w:val="ListBullet"/>
-      </w:pPr>
-      <w:r>
-        <w:rPr>
-          <w:rFonts w:ascii="Calibri" w:hAnsi="Calibri" w:eastAsia="Microsoft YaHei"/>
-          <w:color w:val="000000"/>
-          <w:sz w:val="22"/>
-        </w:rPr>
-        <w:t>一块 16:9、建议 1920 × 1080 的大屏幕或投影。</w:t>
-      </w:r>
-    </w:p>
-    <w:p>
-      <w:pPr>
-        <w:pStyle w:val="ListBullet"/>
-      </w:pPr>
-      <w:r>
-        <w:rPr>
-          <w:rFonts w:ascii="Calibri" w:hAnsi="Calibri" w:eastAsia="Microsoft YaHei"/>
-          <w:color w:val="000000"/>
-          <w:sz w:val="22"/>
-        </w:rPr>
-        <w:t>一个鼠标或触控板；作品当前以鼠标交互为主。</w:t>
-      </w:r>
-    </w:p>
-    <w:p>
-      <w:pPr>
-        <w:pStyle w:val="ListBullet"/>
-      </w:pPr>
-      <w:r>
-        <w:rPr>
-          <w:rFonts w:ascii="Calibri" w:hAnsi="Calibri" w:eastAsia="Microsoft YaHei"/>
-          <w:color w:val="000000"/>
-          <w:sz w:val="22"/>
-        </w:rPr>
-        <w:t>中等音量的扬声器，使天气和操作声音可辨认但不压过展厅。</w:t>
-      </w:r>
-    </w:p>
-    <w:p>
-      <w:pPr>
-        <w:pStyle w:val="ListBullet"/>
-      </w:pPr>
-      <w:r>
-        <w:rPr>
-          <w:rFonts w:ascii="Calibri" w:hAnsi="Calibri" w:eastAsia="Microsoft YaHei"/>
-          <w:color w:val="000000"/>
-          <w:sz w:val="22"/>
-        </w:rPr>
-        <w:t>使用当前 Chromium 浏览器并打开 http://localhost:3001。</w:t>
-      </w:r>
-    </w:p>
-    <w:p>
-      <w:pPr>
-        <w:pStyle w:val="ListBullet"/>
-      </w:pPr>
-      <w:r>
-        <w:rPr>
-          <w:rFonts w:ascii="Calibri" w:hAnsi="Calibri" w:eastAsia="Microsoft YaHei"/>
-          <w:color w:val="000000"/>
-          <w:sz w:val="22"/>
-        </w:rPr>
-        <w:t>先启动服务端并在整个展览期间保持运行，不要因为端口已占用就重复启动第二个服务。</w:t>
-      </w:r>
-    </w:p>
-    <w:p>
-      <w:pPr>
-        <w:pStyle w:val="ListBullet"/>
-      </w:pPr>
-      <w:r>
-        <w:rPr>
-          <w:rFonts w:ascii="Calibri" w:hAnsi="Calibri" w:eastAsia="Microsoft YaHei"/>
-          <w:color w:val="000000"/>
-          <w:sz w:val="22"/>
-        </w:rPr>
-        <w:t>给观众的一句引导可以是：Ask a question, choose how to fish for it, then decide whether the answer is worth keeping.</w:t>
-      </w:r>
-    </w:p>
-    <w:p>
-      <w:pPr>
-        <w:pStyle w:val="Heading1"/>
-      </w:pPr>
-      <w:r>
-        <w:t>15. 本地运行说明</w:t>
+        <w:t>14. 本地运行说明</w:t>
       </w:r>
     </w:p>
     <w:p>
@@ -8752,7 +8666,7 @@
         <w:pStyle w:val="Heading1"/>
       </w:pPr>
       <w:r>
-        <w:t>16. 项目结构与维护</w:t>
+        <w:t>15. 项目结构与维护</w:t>
       </w:r>
     </w:p>
     <w:tbl>
@@ -9400,7 +9314,7 @@
         <w:pStyle w:val="Heading1"/>
       </w:pPr>
       <w:r>
-        <w:t>17. 字体、库与 AI 制作披露</w:t>
+        <w:t>16. 字体、库与 AI 制作披露</w:t>
       </w:r>
     </w:p>
     <w:tbl>
@@ -9744,7 +9658,7 @@
                 <w:color w:val="10242C"/>
                 <w:sz w:val="18"/>
               </w:rPr>
-              <w:t>仓库缺许可证；公开发布前需确认</w:t>
+              <w:t>免费字体；README 仅记录用途</w:t>
             </w:r>
           </w:p>
         </w:tc>
@@ -9907,7 +9821,7 @@
                 <w:color w:val="10242C"/>
                 <w:sz w:val="18"/>
               </w:rPr>
-              <w:t>按 Pixabay Content License，需保留下载记录</w:t>
+              <w:t>按 Pixabay Content License 使用</w:t>
             </w:r>
           </w:p>
         </w:tc>
@@ -9925,7 +9839,17 @@
           <w:color w:val="000000"/>
           <w:sz w:val="22"/>
         </w:rPr>
-        <w:t>英文 README 的制作披露写为：视觉生产结合 AI 辅助图像生成，以及大量人工选择、合成、透明边缘清理、裁切、图层拆分、色彩匹配和交互整合；运行时动画使用经过准备的真实独立帧或图层。</w:t>
+        <w:t>英文 README 已加入简版 Generative AI Use Declaration。ChatGPT 和 Codex 被说明为开发与文档辅助工具，用于代码调试、交互与音频问题检查、界面文字修改和文档草拟；所有建议均由作者审查、测试和改写后才整合。</w:t>
+      </w:r>
+    </w:p>
+    <w:p>
+      <w:r>
+        <w:rPr>
+          <w:rFonts w:ascii="Calibri" w:hAnsi="Calibri" w:eastAsia="Microsoft YaHei"/>
+          <w:color w:val="000000"/>
+          <w:sz w:val="22"/>
+        </w:rPr>
+        <w:t>声明同时明确说明视觉素材使用了 OpenAI 图像生成工具，但最终素材由 Aaron Jiang 指导、选择并进行合成、透明边缘清理、裁切、图层拆分、色彩匹配和交互整合。作品概念、钓鱼隐喻、交互设计、视觉方向、编辑判断与最终实现仍属于作者。</w:t>
       </w:r>
     </w:p>
     <w:tbl>
@@ -9951,7 +9875,7 @@
               <w:bottom w:w="90" w:type="dxa"/>
               <w:end w:w="120" w:type="dxa"/>
             </w:tcMar>
-            <w:shd w:fill="FFF6DD"/>
+            <w:shd w:fill="F4EBCF"/>
             <w:vAlign w:val="center"/>
           </w:tcPr>
           <w:p>
@@ -9962,10 +9886,10 @@
               <w:rPr>
                 <w:rFonts w:ascii="Calibri" w:hAnsi="Calibri" w:eastAsia="Microsoft YaHei"/>
                 <w:b/>
-                <w:color w:val="9B1C1C"/>
+                <w:color w:val="C62A78"/>
                 <w:sz w:val="21"/>
               </w:rPr>
-              <w:t xml:space="preserve">作者需确认  </w:t>
+              <w:t xml:space="preserve">README 与正式声明的区别  </w:t>
             </w:r>
             <w:r>
               <w:rPr>
@@ -9973,7 +9897,7 @@
                 <w:color w:val="10242C"/>
                 <w:sz w:val="21"/>
               </w:rPr>
-              <w:t>如果学校规定必须写明具体生成工具、模型、日期或 Prompt 过程，应在最终提交前继续扩展这一段。当前仓库没有足够证据让我安全填写这些细节。</w:t>
+              <w:t>README 保留简洁、公开可读的制作披露即可；最终学校提交如果要求截图示例中的完整格式，再另外制作包含 AI systems、specific uses、representative prompts 和 how outputs were used 的独立 Generative AI Use Declaration。</w:t>
             </w:r>
           </w:p>
         </w:tc>
@@ -9989,13 +9913,32 @@
         <w:pStyle w:val="Heading1"/>
       </w:pPr>
       <w:r>
-        <w:t>18. 研究语境与参考文献</w:t>
+        <w:t>17. 研究语境与参考文献</w:t>
+      </w:r>
+    </w:p>
+    <w:p>
+      <w:r>
+        <w:rPr>
+          <w:rFonts w:ascii="Calibri" w:hAnsi="Calibri" w:eastAsia="Microsoft YaHei"/>
+          <w:color w:val="000000"/>
+          <w:sz w:val="22"/>
+        </w:rPr>
+        <w:t>以下文献已从 Final Project Proposal 补回，并与 README 原有背景来源合并。格式统一为 Harvard author-date；网页与游戏页面使用 5 August 2026 作为访问日期。</w:t>
+      </w:r>
+    </w:p>
+    <w:p>
+      <w:pPr>
+        <w:pStyle w:val="Heading2"/>
+      </w:pPr>
+      <w:r>
+        <w:t>17.1 学术与理论文献</w:t>
       </w:r>
     </w:p>
     <w:p>
       <w:pPr>
         <w:spacing w:after="120"/>
         <w:ind w:left="360" w:hanging="360"/>
+        <w:jc w:val="left"/>
       </w:pPr>
       <w:r>
         <w:rPr>
@@ -10003,13 +9946,14 @@
           <w:color w:val="000000"/>
           <w:sz w:val="22"/>
         </w:rPr>
-        <w:t>Bender, E. M., Gebru, T., McMillan-Major, A. and Shmitchell, S. (2021). On the Dangers of Stochastic Parrots: Can Language Models Be Too Big? FAccT '21. https://doi.org/10.1145/3442188.3445922</w:t>
+        <w:t>Amershi, S., Weld, D., Vorvoreanu, M., Fourney, A., Nushi, B., Collisson, P., Suh, J., Iqbal, S., Bennett, P. N., Inkpen, K., Teevan, J., Kikin-Gil, R. and Horvitz, E. (2019) 'Guidelines for human-AI interaction', Proceedings of the 2019 CHI Conference on Human Factors in Computing Systems, pp. 1-13. Available at: https://doi.org/10.1145/3290605.3300233.</w:t>
       </w:r>
     </w:p>
     <w:p>
       <w:pPr>
         <w:spacing w:after="120"/>
         <w:ind w:left="360" w:hanging="360"/>
+        <w:jc w:val="left"/>
       </w:pPr>
       <w:r>
         <w:rPr>
@@ -10017,13 +9961,14 @@
           <w:color w:val="000000"/>
           <w:sz w:val="22"/>
         </w:rPr>
-        <w:t>Bommasani, R. et al. (2021). On the Opportunities and Risks of Foundation Models. https://arxiv.org/abs/2108.07258</w:t>
+        <w:t>Bender, E. M., Gebru, T., McMillan-Major, A. and Shmitchell, S. (2021) 'On the dangers of stochastic parrots: Can language models be too big?', Proceedings of the 2021 ACM Conference on Fairness, Accountability, and Transparency, pp. 610-623. Available at: https://doi.org/10.1145/3442188.3445922.</w:t>
       </w:r>
     </w:p>
     <w:p>
       <w:pPr>
         <w:spacing w:after="120"/>
         <w:ind w:left="360" w:hanging="360"/>
+        <w:jc w:val="left"/>
       </w:pPr>
       <w:r>
         <w:rPr>
@@ -10031,13 +9976,14 @@
           <w:color w:val="000000"/>
           <w:sz w:val="22"/>
         </w:rPr>
-        <w:t>Crawford, K. (2021). Atlas of AI: Power, Politics, and the Planetary Costs of Artificial Intelligence. Yale University Press.</w:t>
+        <w:t>Bommasani, R. et al. (2021) 'On the opportunities and risks of foundation models', arXiv. Available at: https://arxiv.org/abs/2108.07258.</w:t>
       </w:r>
     </w:p>
     <w:p>
       <w:pPr>
         <w:spacing w:after="120"/>
         <w:ind w:left="360" w:hanging="360"/>
+        <w:jc w:val="left"/>
       </w:pPr>
       <w:r>
         <w:rPr>
@@ -10045,13 +9991,14 @@
           <w:color w:val="000000"/>
           <w:sz w:val="22"/>
         </w:rPr>
-        <w:t>National Institute of Standards and Technology (2023). Artificial Intelligence Risk Management Framework (AI RMF 1.0). https://doi.org/10.6028/NIST.AI.100-1</w:t>
+        <w:t>Crawford, K. (2021) Atlas of AI: Power, politics, and the planetary costs of artificial intelligence. New Haven: Yale University Press.</w:t>
       </w:r>
     </w:p>
     <w:p>
       <w:pPr>
         <w:spacing w:after="120"/>
         <w:ind w:left="360" w:hanging="360"/>
+        <w:jc w:val="left"/>
       </w:pPr>
       <w:r>
         <w:rPr>
@@ -10059,13 +10006,14 @@
           <w:color w:val="000000"/>
           <w:sz w:val="22"/>
         </w:rPr>
-        <w:t>OpenAI. Responses API Reference. https://platform.openai.com/docs/api-reference/responses</w:t>
+        <w:t>Gröner, F. and Chiou, E. K. (2024) 'Investigating the impact of user interface designs on expectations about large language models' capabilities', Proceedings of the Human Factors and Ergonomics Society Annual Meeting, 68(1), pp. 155-161. Available at: https://doi.org/10.1177/10711813241260399.</w:t>
       </w:r>
     </w:p>
     <w:p>
       <w:pPr>
         <w:spacing w:after="120"/>
         <w:ind w:left="360" w:hanging="360"/>
+        <w:jc w:val="left"/>
       </w:pPr>
       <w:r>
         <w:rPr>
@@ -10073,7 +10021,278 @@
           <w:color w:val="000000"/>
           <w:sz w:val="22"/>
         </w:rPr>
-        <w:t>Pixabay. Content License Summary. https://pixabay.com/service/license-summary/</w:t>
+        <w:t>Kapoor, S., Gruver, N., Roberts, M., Collins, K., Pal, A., Bhatt, U., Weller, A., Dooley, S., Goldblum, M. and Wilson, A. G. (2024) 'Large language models must be taught to know what they don't know', Advances in Neural Information Processing Systems, 37. Available at: https://doi.org/10.52202/079017-2729.</w:t>
+      </w:r>
+    </w:p>
+    <w:p>
+      <w:pPr>
+        <w:spacing w:after="120"/>
+        <w:ind w:left="360" w:hanging="360"/>
+        <w:jc w:val="left"/>
+      </w:pPr>
+      <w:r>
+        <w:rPr>
+          <w:rFonts w:ascii="Calibri" w:hAnsi="Calibri" w:eastAsia="Microsoft YaHei"/>
+          <w:color w:val="000000"/>
+          <w:sz w:val="22"/>
+        </w:rPr>
+        <w:t>Kidd, C. and Birhane, A. (2023) 'How AI can distort human beliefs', Science, 380(6651), pp. 1222-1223. Available at: https://doi.org/10.1126/science.adi0248.</w:t>
+      </w:r>
+    </w:p>
+    <w:p>
+      <w:pPr>
+        <w:spacing w:after="120"/>
+        <w:ind w:left="360" w:hanging="360"/>
+        <w:jc w:val="left"/>
+      </w:pPr>
+      <w:r>
+        <w:rPr>
+          <w:rFonts w:ascii="Calibri" w:hAnsi="Calibri" w:eastAsia="Microsoft YaHei"/>
+          <w:color w:val="000000"/>
+          <w:sz w:val="22"/>
+        </w:rPr>
+        <w:t>Kim, S. S. Y., Liao, Q. V., Vorvoreanu, M., Ballard, S. and Vaughan, J. W. (2024) '"I'm not sure, but...": Examining the impact of large language models' uncertainty expression on user reliance and trust', Proceedings of the 2024 ACM Conference on Fairness, Accountability, and Transparency, pp. 822-835. Available at: https://arxiv.org/abs/2405.00623.</w:t>
+      </w:r>
+    </w:p>
+    <w:p>
+      <w:pPr>
+        <w:spacing w:after="120"/>
+        <w:ind w:left="360" w:hanging="360"/>
+        <w:jc w:val="left"/>
+      </w:pPr>
+      <w:r>
+        <w:rPr>
+          <w:rFonts w:ascii="Calibri" w:hAnsi="Calibri" w:eastAsia="Microsoft YaHei"/>
+          <w:color w:val="000000"/>
+          <w:sz w:val="22"/>
+        </w:rPr>
+        <w:t>Liao, Q. V. and Vaughan, J. W. (2024) 'AI transparency in the age of LLMs: A human-centered research roadmap', Harvard Data Science Review, Special Issue 5. Available at: https://doi.org/10.1162/99608f92.8036d03b.</w:t>
+      </w:r>
+    </w:p>
+    <w:p>
+      <w:pPr>
+        <w:spacing w:after="120"/>
+        <w:ind w:left="360" w:hanging="360"/>
+        <w:jc w:val="left"/>
+      </w:pPr>
+      <w:r>
+        <w:rPr>
+          <w:rFonts w:ascii="Calibri" w:hAnsi="Calibri" w:eastAsia="Microsoft YaHei"/>
+          <w:color w:val="000000"/>
+          <w:sz w:val="22"/>
+        </w:rPr>
+        <w:t>Ling, S., Zhang, Y. and Du, N. (2024) 'More is not always better: Impacts of AI-generated confidence and explanations in human-automation interaction', Human Factors, 66(12), pp. 2606-2620. Available at: https://doi.org/10.1177/00187208241234810.</w:t>
+      </w:r>
+    </w:p>
+    <w:p>
+      <w:pPr>
+        <w:spacing w:after="120"/>
+        <w:ind w:left="360" w:hanging="360"/>
+        <w:jc w:val="left"/>
+      </w:pPr>
+      <w:r>
+        <w:rPr>
+          <w:rFonts w:ascii="Calibri" w:hAnsi="Calibri" w:eastAsia="Microsoft YaHei"/>
+          <w:color w:val="000000"/>
+          <w:sz w:val="22"/>
+        </w:rPr>
+        <w:t>Louison, M., Stein, J. A. and Suski, C. (2018) 'Why do some fish strike fishing lures? Physiological and behavioral mechanisms', paper presented at the 2018 Midwest Fish and Wildlife Conference, Milwaukee, Wisconsin, 28-31 January. Available at: https://experts.illinois.edu/en/publications/why-do-some-fish-strike-fishing-lures-physiological-and-behaviora/.</w:t>
+      </w:r>
+    </w:p>
+    <w:p>
+      <w:pPr>
+        <w:spacing w:after="120"/>
+        <w:ind w:left="360" w:hanging="360"/>
+        <w:jc w:val="left"/>
+      </w:pPr>
+      <w:r>
+        <w:rPr>
+          <w:rFonts w:ascii="Calibri" w:hAnsi="Calibri" w:eastAsia="Microsoft YaHei"/>
+          <w:color w:val="000000"/>
+          <w:sz w:val="22"/>
+        </w:rPr>
+        <w:t>Messeri, L. and Crockett, M. J. (2024) 'Artificial intelligence and illusions of understanding in scientific research', Nature, 627, pp. 49-58. Available at: https://doi.org/10.1038/s41586-024-07146-0.</w:t>
+      </w:r>
+    </w:p>
+    <w:p>
+      <w:pPr>
+        <w:spacing w:after="120"/>
+        <w:ind w:left="360" w:hanging="360"/>
+        <w:jc w:val="left"/>
+      </w:pPr>
+      <w:r>
+        <w:rPr>
+          <w:rFonts w:ascii="Calibri" w:hAnsi="Calibri" w:eastAsia="Microsoft YaHei"/>
+          <w:color w:val="000000"/>
+          <w:sz w:val="22"/>
+        </w:rPr>
+        <w:t>Monk, C. T. and Arlinghaus, R. (2017) 'Encountering a bait is necessary but insufficient to explain individual variability in vulnerability to angling in two freshwater benthivorous fish in the wild', PLOS ONE, 12(3), e0173989. Available at: https://doi.org/10.1371/journal.pone.0173989.</w:t>
+      </w:r>
+    </w:p>
+    <w:p>
+      <w:pPr>
+        <w:spacing w:after="120"/>
+        <w:ind w:left="360" w:hanging="360"/>
+        <w:jc w:val="left"/>
+      </w:pPr>
+      <w:r>
+        <w:rPr>
+          <w:rFonts w:ascii="Calibri" w:hAnsi="Calibri" w:eastAsia="Microsoft YaHei"/>
+          <w:color w:val="000000"/>
+          <w:sz w:val="22"/>
+        </w:rPr>
+        <w:t>National Institute of Standards and Technology (2023) Artificial Intelligence Risk Management Framework (AI RMF 1.0). Available at: https://doi.org/10.6028/NIST.AI.100-1.</w:t>
+      </w:r>
+    </w:p>
+    <w:p>
+      <w:pPr>
+        <w:spacing w:after="120"/>
+        <w:ind w:left="360" w:hanging="360"/>
+        <w:jc w:val="left"/>
+      </w:pPr>
+      <w:r>
+        <w:rPr>
+          <w:rFonts w:ascii="Calibri" w:hAnsi="Calibri" w:eastAsia="Microsoft YaHei"/>
+          <w:color w:val="000000"/>
+          <w:sz w:val="22"/>
+        </w:rPr>
+        <w:t>Prabhudesai, S., Goldstein, D. G., Hofman, J. M. and Rothschild, D. M. (2024) 'A taxonomy for understanding and identifying uncertainty in AI-generated responses', SSRN. Available at: https://doi.org/10.2139/ssrn.4836380.</w:t>
+      </w:r>
+    </w:p>
+    <w:p>
+      <w:pPr>
+        <w:spacing w:after="120"/>
+        <w:ind w:left="360" w:hanging="360"/>
+        <w:jc w:val="left"/>
+      </w:pPr>
+      <w:r>
+        <w:rPr>
+          <w:rFonts w:ascii="Calibri" w:hAnsi="Calibri" w:eastAsia="Microsoft YaHei"/>
+          <w:color w:val="000000"/>
+          <w:sz w:val="22"/>
+        </w:rPr>
+        <w:t>Schulhoff, S. et al. (2024) 'The Prompt Report: A systematic survey of prompting techniques', arXiv. Available at: https://doi.org/10.48550/arXiv.2406.06608.</w:t>
+      </w:r>
+    </w:p>
+    <w:p>
+      <w:pPr>
+        <w:spacing w:after="120"/>
+        <w:ind w:left="360" w:hanging="360"/>
+        <w:jc w:val="left"/>
+      </w:pPr>
+      <w:r>
+        <w:rPr>
+          <w:rFonts w:ascii="Calibri" w:hAnsi="Calibri" w:eastAsia="Microsoft YaHei"/>
+          <w:color w:val="000000"/>
+          <w:sz w:val="22"/>
+        </w:rPr>
+        <w:t>Wang, B., Liu, J., Karimnazarov, J. and Thompson, N. (2024) 'Task supportive and personalized human-large language model interaction: A user study', Proceedings of the 2024 ACM SIGIR Conference on Human Information Interaction and Retrieval, pp. 370-375. Available at: https://doi.org/10.1145/3627508.3638344.</w:t>
+      </w:r>
+    </w:p>
+    <w:p>
+      <w:pPr>
+        <w:pStyle w:val="Heading2"/>
+      </w:pPr>
+      <w:r>
+        <w:t>17.2 视觉与界面参考</w:t>
+      </w:r>
+    </w:p>
+    <w:p>
+      <w:pPr>
+        <w:spacing w:after="120"/>
+        <w:ind w:left="360" w:hanging="360"/>
+        <w:jc w:val="left"/>
+      </w:pPr>
+      <w:r>
+        <w:rPr>
+          <w:rFonts w:ascii="Calibri" w:hAnsi="Calibri" w:eastAsia="Microsoft YaHei"/>
+          <w:color w:val="000000"/>
+          <w:sz w:val="22"/>
+        </w:rPr>
+        <w:t>Black Salt Games (2023) DREDGE [video game]. Team17. Available at: https://store.steampowered.com/app/1562430/DREDGE/ (Accessed: 5 August 2026).</w:t>
+      </w:r>
+    </w:p>
+    <w:p>
+      <w:pPr>
+        <w:spacing w:after="120"/>
+        <w:ind w:left="360" w:hanging="360"/>
+        <w:jc w:val="left"/>
+      </w:pPr>
+      <w:r>
+        <w:rPr>
+          <w:rFonts w:ascii="Calibri" w:hAnsi="Calibri" w:eastAsia="Microsoft YaHei"/>
+          <w:color w:val="000000"/>
+          <w:sz w:val="22"/>
+        </w:rPr>
+        <w:t>Dream Dock (forthcoming 2026) DREADMOOR [video game]. Digital Vortex Entertainment. Available at: https://store.steampowered.com/app/3629430/DREADMOOR/ (Accessed: 5 August 2026).</w:t>
+      </w:r>
+    </w:p>
+    <w:p>
+      <w:pPr>
+        <w:spacing w:after="120"/>
+        <w:ind w:left="360" w:hanging="360"/>
+        <w:jc w:val="left"/>
+      </w:pPr>
+      <w:r>
+        <w:rPr>
+          <w:rFonts w:ascii="Calibri" w:hAnsi="Calibri" w:eastAsia="Microsoft YaHei"/>
+          <w:color w:val="000000"/>
+          <w:sz w:val="22"/>
+        </w:rPr>
+        <w:t>lamedeveloper (2024) WEBFISHING [video game]. lamedeveloper. Available at: https://store.steampowered.com/app/3146520/WEBFISHING/ (Accessed: 5 August 2026).</w:t>
+      </w:r>
+    </w:p>
+    <w:p>
+      <w:pPr>
+        <w:spacing w:after="120"/>
+        <w:ind w:left="360" w:hanging="360"/>
+        <w:jc w:val="left"/>
+      </w:pPr>
+      <w:r>
+        <w:rPr>
+          <w:rFonts w:ascii="Calibri" w:hAnsi="Calibri" w:eastAsia="Microsoft YaHei"/>
+          <w:color w:val="000000"/>
+          <w:sz w:val="22"/>
+        </w:rPr>
+        <w:t>Wombat Brawler (2025) Cast n Chill [video game]. Wombat Brawler. Available at: https://store.steampowered.com/app/3483740/Cast_n_Chill/ (Accessed: 5 August 2026).</w:t>
+      </w:r>
+    </w:p>
+    <w:p>
+      <w:pPr>
+        <w:pStyle w:val="Heading2"/>
+      </w:pPr>
+      <w:r>
+        <w:t>17.3 技术与许可参考</w:t>
+      </w:r>
+    </w:p>
+    <w:p>
+      <w:pPr>
+        <w:spacing w:after="120"/>
+        <w:ind w:left="360" w:hanging="360"/>
+        <w:jc w:val="left"/>
+      </w:pPr>
+      <w:r>
+        <w:rPr>
+          <w:rFonts w:ascii="Calibri" w:hAnsi="Calibri" w:eastAsia="Microsoft YaHei"/>
+          <w:color w:val="000000"/>
+          <w:sz w:val="22"/>
+        </w:rPr>
+        <w:t>OpenAI (n.d.) Responses API reference. Available at: https://platform.openai.com/docs/api-reference/responses (Accessed: 5 August 2026).</w:t>
+      </w:r>
+    </w:p>
+    <w:p>
+      <w:pPr>
+        <w:spacing w:after="120"/>
+        <w:ind w:left="360" w:hanging="360"/>
+        <w:jc w:val="left"/>
+      </w:pPr>
+      <w:r>
+        <w:rPr>
+          <w:rFonts w:ascii="Calibri" w:hAnsi="Calibri" w:eastAsia="Microsoft YaHei"/>
+          <w:color w:val="000000"/>
+          <w:sz w:val="22"/>
+        </w:rPr>
+        <w:t>Pixabay (n.d.) Content License Summary. Available at: https://pixabay.com/service/license-summary/ (Accessed: 5 August 2026).</w:t>
       </w:r>
     </w:p>
     <w:p>
@@ -10081,7 +10300,7 @@
         <w:pStyle w:val="Heading1"/>
       </w:pPr>
       <w:r>
-        <w:t>19. 当前限制</w:t>
+        <w:t>18. 当前限制</w:t>
       </w:r>
     </w:p>
     <w:p>
@@ -10107,7 +10326,7 @@
           <w:color w:val="000000"/>
           <w:sz w:val="22"/>
         </w:rPr>
-        <w:t>Signal Canal 目前没有实时浏览或 web-search 工具。</w:t>
+        <w:t>Signal Canal 采用搜索导向的 Prompt 与界面隐喻，但目前没有实时浏览或 web-search 工具，因此不能宣称答案经过实时联网核查。</w:t>
       </w:r>
     </w:p>
     <w:p>
@@ -10151,23 +10370,10 @@
     </w:p>
     <w:p>
       <w:pPr>
-        <w:pStyle w:val="ListBullet"/>
-      </w:pPr>
-      <w:r>
-        <w:rPr>
-          <w:rFonts w:ascii="Calibri" w:hAnsi="Calibri" w:eastAsia="Microsoft YaHei"/>
-          <w:color w:val="000000"/>
-          <w:sz w:val="22"/>
-        </w:rPr>
-        <w:t>RetroSans 的再分发许可仍缺仓库内证据。</w:t>
-      </w:r>
-    </w:p>
-    <w:p>
-      <w:pPr>
         <w:pStyle w:val="Heading1"/>
       </w:pPr>
       <w:r>
-        <w:t>20. 作者审查清单</w:t>
+        <w:t>19. 作者审查清单</w:t>
       </w:r>
     </w:p>
     <w:tbl>
@@ -10179,8 +10385,8 @@
         <w:tblInd w:w="120" w:type="dxa"/>
       </w:tblPr>
       <w:tblGrid>
-        <w:gridCol w:w="900"/>
-        <w:gridCol w:w="8460"/>
+        <w:gridCol w:w="1200"/>
+        <w:gridCol w:w="8160"/>
       </w:tblGrid>
       <w:tr>
         <w:trPr>
@@ -10189,7 +10395,7 @@
         </w:trPr>
         <w:tc>
           <w:tcPr>
-            <w:tcW w:type="dxa" w:w="900"/>
+            <w:tcW w:type="dxa" w:w="1200"/>
             <w:tcMar>
               <w:top w:w="90" w:type="dxa"/>
               <w:start w:w="120" w:type="dxa"/>
@@ -10211,13 +10417,13 @@
                 <w:color w:val="FFFFFF"/>
                 <w:sz w:val="19"/>
               </w:rPr>
-              <w:t>确认</w:t>
+              <w:t>状态</w:t>
             </w:r>
           </w:p>
         </w:tc>
         <w:tc>
           <w:tcPr>
-            <w:tcW w:type="dxa" w:w="8460"/>
+            <w:tcW w:type="dxa" w:w="8160"/>
             <w:tcMar>
               <w:top w:w="90" w:type="dxa"/>
               <w:start w:w="120" w:type="dxa"/>
@@ -10239,7 +10445,7 @@
                 <w:color w:val="FFFFFF"/>
                 <w:sz w:val="19"/>
               </w:rPr>
-              <w:t>问题</w:t>
+              <w:t>结论</w:t>
             </w:r>
           </w:p>
         </w:tc>
@@ -10247,7 +10453,7 @@
       <w:tr>
         <w:tc>
           <w:tcPr>
-            <w:tcW w:type="dxa" w:w="900"/>
+            <w:tcW w:type="dxa" w:w="1200"/>
             <w:vAlign w:val="center"/>
             <w:tcMar>
               <w:top w:w="90" w:type="dxa"/>
@@ -10267,13 +10473,13 @@
                 <w:color w:val="10242C"/>
                 <w:sz w:val="19"/>
               </w:rPr>
-              <w:t>□</w:t>
+              <w:t>已确认</w:t>
             </w:r>
           </w:p>
         </w:tc>
         <w:tc>
           <w:tcPr>
-            <w:tcW w:type="dxa" w:w="8460"/>
+            <w:tcW w:type="dxa" w:w="8160"/>
             <w:vAlign w:val="center"/>
             <w:tcMar>
               <w:top w:w="90" w:type="dxa"/>
@@ -10293,7 +10499,7 @@
                 <w:color w:val="10242C"/>
                 <w:sz w:val="19"/>
               </w:rPr>
-              <w:t>标题、作者 Aaron Jiang、年份 2026 是否正确</w:t>
+              <w:t>标题、作者 Aaron Jiang 和年份 2026 正确</w:t>
             </w:r>
           </w:p>
         </w:tc>
@@ -10301,7 +10507,7 @@
       <w:tr>
         <w:tc>
           <w:tcPr>
-            <w:tcW w:type="dxa" w:w="900"/>
+            <w:tcW w:type="dxa" w:w="1200"/>
             <w:shd w:fill="FAFBFB"/>
             <w:vAlign w:val="center"/>
             <w:tcMar>
@@ -10322,13 +10528,13 @@
                 <w:color w:val="10242C"/>
                 <w:sz w:val="19"/>
               </w:rPr>
-              <w:t>□</w:t>
+              <w:t>已确认</w:t>
             </w:r>
           </w:p>
         </w:tc>
         <w:tc>
           <w:tcPr>
-            <w:tcW w:type="dxa" w:w="8460"/>
+            <w:tcW w:type="dxa" w:w="8160"/>
             <w:shd w:fill="FAFBFB"/>
             <w:vAlign w:val="center"/>
             <w:tcMar>
@@ -10349,7 +10555,7 @@
                 <w:color w:val="10242C"/>
                 <w:sz w:val="19"/>
               </w:rPr>
-              <w:t>是否需要补充课程、学院和学校的正式英文名称</w:t>
+              <w:t>README 不补充课程、学院和学校名称</w:t>
             </w:r>
           </w:p>
         </w:tc>
@@ -10357,7 +10563,7 @@
       <w:tr>
         <w:tc>
           <w:tcPr>
-            <w:tcW w:type="dxa" w:w="900"/>
+            <w:tcW w:type="dxa" w:w="1200"/>
             <w:vAlign w:val="center"/>
             <w:tcMar>
               <w:top w:w="90" w:type="dxa"/>
@@ -10377,13 +10583,13 @@
                 <w:color w:val="10242C"/>
                 <w:sz w:val="19"/>
               </w:rPr>
-              <w:t>□</w:t>
+              <w:t>后续</w:t>
             </w:r>
           </w:p>
         </w:tc>
         <w:tc>
           <w:tcPr>
-            <w:tcW w:type="dxa" w:w="8460"/>
+            <w:tcW w:type="dxa" w:w="8160"/>
             <w:vAlign w:val="center"/>
             <w:tcMar>
               <w:top w:w="90" w:type="dxa"/>
@@ -10403,7 +10609,7 @@
                 <w:color w:val="10242C"/>
                 <w:sz w:val="19"/>
               </w:rPr>
-              <w:t>是否已有公开试玩和视频链接可加入 README 顶部</w:t>
+              <w:t>公开试玩和视频链接完成后再加入 README 顶部</w:t>
             </w:r>
           </w:p>
         </w:tc>
@@ -10411,7 +10617,7 @@
       <w:tr>
         <w:tc>
           <w:tcPr>
-            <w:tcW w:type="dxa" w:w="900"/>
+            <w:tcW w:type="dxa" w:w="1200"/>
             <w:shd w:fill="FAFBFB"/>
             <w:vAlign w:val="center"/>
             <w:tcMar>
@@ -10432,13 +10638,13 @@
                 <w:color w:val="10242C"/>
                 <w:sz w:val="19"/>
               </w:rPr>
-              <w:t>□</w:t>
+              <w:t>已确认</w:t>
             </w:r>
           </w:p>
         </w:tc>
         <w:tc>
           <w:tcPr>
-            <w:tcW w:type="dxa" w:w="8460"/>
+            <w:tcW w:type="dxa" w:w="8160"/>
             <w:shd w:fill="FAFBFB"/>
             <w:vAlign w:val="center"/>
             <w:tcMar>
@@ -10459,7 +10665,7 @@
                 <w:color w:val="10242C"/>
                 <w:sz w:val="19"/>
               </w:rPr>
-              <w:t>Signal Canal 的限制说明是否接受，或是否要真正接入 web search</w:t>
+              <w:t>Signal Canal 保持搜索导向表达，不在答辩前新增实时 web search</w:t>
             </w:r>
           </w:p>
         </w:tc>
@@ -10467,7 +10673,7 @@
       <w:tr>
         <w:tc>
           <w:tcPr>
-            <w:tcW w:type="dxa" w:w="900"/>
+            <w:tcW w:type="dxa" w:w="1200"/>
             <w:vAlign w:val="center"/>
             <w:tcMar>
               <w:top w:w="90" w:type="dxa"/>
@@ -10487,13 +10693,13 @@
                 <w:color w:val="10242C"/>
                 <w:sz w:val="19"/>
               </w:rPr>
-              <w:t>□</w:t>
+              <w:t>已确认</w:t>
             </w:r>
           </w:p>
         </w:tc>
         <w:tc>
           <w:tcPr>
-            <w:tcW w:type="dxa" w:w="8460"/>
+            <w:tcW w:type="dxa" w:w="8160"/>
             <w:vAlign w:val="center"/>
             <w:tcMar>
               <w:top w:w="90" w:type="dxa"/>
@@ -10505,7 +10711,7 @@
           <w:p>
             <w:pPr>
               <w:spacing w:after="0" w:line="259" w:lineRule="auto"/>
-              <w:jc w:val="center"/>
+              <w:jc w:val="left"/>
             </w:pPr>
             <w:r>
               <w:rPr>
@@ -10513,7 +10719,7 @@
                 <w:color w:val="10242C"/>
                 <w:sz w:val="19"/>
               </w:rPr>
-              <w:t>AI 图像制作披露是否符合学校政策</w:t>
+              <w:t>README 加入简版生成式 AI 使用声明；学校允许使用，但必须说清楚</w:t>
             </w:r>
           </w:p>
         </w:tc>
@@ -10521,7 +10727,7 @@
       <w:tr>
         <w:tc>
           <w:tcPr>
-            <w:tcW w:type="dxa" w:w="900"/>
+            <w:tcW w:type="dxa" w:w="1200"/>
             <w:shd w:fill="FAFBFB"/>
             <w:vAlign w:val="center"/>
             <w:tcMar>
@@ -10542,13 +10748,13 @@
                 <w:color w:val="10242C"/>
                 <w:sz w:val="19"/>
               </w:rPr>
-              <w:t>□</w:t>
+              <w:t>已确认</w:t>
             </w:r>
           </w:p>
         </w:tc>
         <w:tc>
           <w:tcPr>
-            <w:tcW w:type="dxa" w:w="8460"/>
+            <w:tcW w:type="dxa" w:w="8160"/>
             <w:shd w:fill="FAFBFB"/>
             <w:vAlign w:val="center"/>
             <w:tcMar>
@@ -10569,7 +10775,7 @@
                 <w:color w:val="10242C"/>
                 <w:sz w:val="19"/>
               </w:rPr>
-              <w:t>是否能补充 RetroSans 的来源和许可证</w:t>
+              <w:t>不把 RetroSans 许可证作为当前 README 待办</w:t>
             </w:r>
           </w:p>
         </w:tc>
@@ -10577,7 +10783,7 @@
       <w:tr>
         <w:tc>
           <w:tcPr>
-            <w:tcW w:type="dxa" w:w="900"/>
+            <w:tcW w:type="dxa" w:w="1200"/>
             <w:vAlign w:val="center"/>
             <w:tcMar>
               <w:top w:w="90" w:type="dxa"/>
@@ -10597,13 +10803,13 @@
                 <w:color w:val="10242C"/>
                 <w:sz w:val="19"/>
               </w:rPr>
-              <w:t>□</w:t>
+              <w:t>已确认</w:t>
             </w:r>
           </w:p>
         </w:tc>
         <w:tc>
           <w:tcPr>
-            <w:tcW w:type="dxa" w:w="8460"/>
+            <w:tcW w:type="dxa" w:w="8160"/>
             <w:vAlign w:val="center"/>
             <w:tcMar>
               <w:top w:w="90" w:type="dxa"/>
@@ -10623,7 +10829,7 @@
                 <w:color w:val="10242C"/>
                 <w:sz w:val="19"/>
               </w:rPr>
-              <w:t>是否已保存 21 条 Pixabay 素材的下载凭证</w:t>
+              <w:t>不要求在 README 中列 Pixabay 下载凭证</w:t>
             </w:r>
           </w:p>
         </w:tc>
@@ -10631,7 +10837,7 @@
       <w:tr>
         <w:tc>
           <w:tcPr>
-            <w:tcW w:type="dxa" w:w="900"/>
+            <w:tcW w:type="dxa" w:w="1200"/>
             <w:shd w:fill="FAFBFB"/>
             <w:vAlign w:val="center"/>
             <w:tcMar>
@@ -10652,13 +10858,13 @@
                 <w:color w:val="10242C"/>
                 <w:sz w:val="19"/>
               </w:rPr>
-              <w:t>□</w:t>
+              <w:t>已完成</w:t>
             </w:r>
           </w:p>
         </w:tc>
         <w:tc>
           <w:tcPr>
-            <w:tcW w:type="dxa" w:w="8460"/>
+            <w:tcW w:type="dxa" w:w="8160"/>
             <w:shd w:fill="FAFBFB"/>
             <w:vAlign w:val="center"/>
             <w:tcMar>
@@ -10679,7 +10885,7 @@
                 <w:color w:val="10242C"/>
                 <w:sz w:val="19"/>
               </w:rPr>
-              <w:t>参考文献是否与最终论文和导师要求一致</w:t>
+              <w:t>参考文献已按 Harvard author-date 格式整理并补回 proposal 来源</w:t>
             </w:r>
           </w:p>
         </w:tc>
@@ -10687,7 +10893,7 @@
       <w:tr>
         <w:tc>
           <w:tcPr>
-            <w:tcW w:type="dxa" w:w="900"/>
+            <w:tcW w:type="dxa" w:w="1200"/>
             <w:vAlign w:val="center"/>
             <w:tcMar>
               <w:top w:w="90" w:type="dxa"/>
@@ -10707,13 +10913,13 @@
                 <w:color w:val="10242C"/>
                 <w:sz w:val="19"/>
               </w:rPr>
-              <w:t>□</w:t>
+              <w:t>已确认</w:t>
             </w:r>
           </w:p>
         </w:tc>
         <w:tc>
           <w:tcPr>
-            <w:tcW w:type="dxa" w:w="8460"/>
+            <w:tcW w:type="dxa" w:w="8160"/>
             <w:vAlign w:val="center"/>
             <w:tcMar>
               <w:top w:w="90" w:type="dxa"/>
@@ -10733,7 +10939,7 @@
                 <w:color w:val="10242C"/>
                 <w:sz w:val="19"/>
               </w:rPr>
-              <w:t>展览设备、屏幕尺寸和观众引导语是否符合现场</w:t>
+              <w:t>README 不增加现场设备和观众引导检查项</w:t>
             </w:r>
           </w:p>
         </w:tc>
@@ -10741,7 +10947,7 @@
       <w:tr>
         <w:tc>
           <w:tcPr>
-            <w:tcW w:type="dxa" w:w="900"/>
+            <w:tcW w:type="dxa" w:w="1200"/>
             <w:shd w:fill="FAFBFB"/>
             <w:vAlign w:val="center"/>
             <w:tcMar>
@@ -10762,13 +10968,13 @@
                 <w:color w:val="10242C"/>
                 <w:sz w:val="19"/>
               </w:rPr>
-              <w:t>□</w:t>
+              <w:t>已确认</w:t>
             </w:r>
           </w:p>
         </w:tc>
         <w:tc>
           <w:tcPr>
-            <w:tcW w:type="dxa" w:w="8460"/>
+            <w:tcW w:type="dxa" w:w="8160"/>
             <w:shd w:fill="FAFBFB"/>
             <w:vAlign w:val="center"/>
             <w:tcMar>
@@ -10789,7 +10995,7 @@
                 <w:color w:val="10242C"/>
                 <w:sz w:val="19"/>
               </w:rPr>
-              <w:t>英文 README 的作品语气是否符合你的个人表达</w:t>
+              <w:t>英文 README 的作品语气可以保留</w:t>
             </w:r>
           </w:p>
         </w:tc>
@@ -10837,7 +11043,7 @@
                 <w:color w:val="C62A78"/>
                 <w:sz w:val="21"/>
               </w:rPr>
-              <w:t xml:space="preserve">审查完成后的下一步  </w:t>
+              <w:t xml:space="preserve">剩余后续事项  </w:t>
             </w:r>
             <w:r>
               <w:rPr>
@@ -10845,7 +11051,7 @@
                 <w:color w:val="10242C"/>
                 <w:sz w:val="21"/>
               </w:rPr>
-              <w:t>你可以直接在这份 Word 中批注需要修改的段落。确认课程信息、链接、RetroSans 许可和 AI 图像披露后，再把对应内容同步回英文 README。</w:t>
+              <w:t>只有公开试玩链接、视频链接和学校最终要求的独立 Generative AI Use Declaration 尚待后续提交阶段完成；README 当前内容已经按本轮决定同步。</w:t>
             </w:r>
           </w:p>
         </w:tc>

</xml_diff>